<commit_message>
feat(templates): rewrite converter to substitution-based agent with SSE, project-level templates [F-0067]
Replace the XML-generation pipeline with a DOCX substitution approach:
the AI identifies variable values in the uploaded document and the code
does find-and-replace, preserving all original formatting. Adds 7 agent
tools (apply_substitutions, add_table_loop, modify_table, remove_section,
add_content, validate, compare_to_original), SSE streaming for real-time
progress, trace.json logging for debugging, ULID conversion IDs, and
project-scoped template creation in project settings.

Co-Authored-By: Claude Opus 4.6 (1M context) <noreply@anthropic.com>
</commit_message>
<xml_diff>
--- a/backend/tests/artifacts/sample_filled_sop.docx
+++ b/backend/tests/artifacts/sample_filled_sop.docx
@@ -5,6 +5,7 @@
     <w:p>
       <w:pPr>
         <w:pStyle w:val="Heading1"/>
+        <w:jc w:val="center"/>
       </w:pPr>
       <w:r>
         <w:t>Buffer Preparation SOP</w:t>
@@ -12,7 +13,7 @@
     </w:p>
     <w:tbl>
       <w:tblPr>
-        <w:tblStyle w:val="LightGrid-Accent1"/>
+        <w:tblStyle w:val="TableGrid"/>
         <w:tblW w:type="auto" w:w="0"/>
         <w:tblLook w:firstColumn="1" w:firstRow="1" w:lastColumn="0" w:lastRow="0" w:noHBand="0" w:noVBand="1" w:val="04A0"/>
       </w:tblPr>
@@ -27,6 +28,9 @@
           </w:tcPr>
           <w:p>
             <w:r>
+              <w:rPr>
+                <w:b/>
+              </w:rPr>
               <w:t>Document Number:</w:t>
             </w:r>
           </w:p>
@@ -49,6 +53,9 @@
           </w:tcPr>
           <w:p>
             <w:r>
+              <w:rPr>
+                <w:b/>
+              </w:rPr>
               <w:t>Effective Date:</w:t>
             </w:r>
           </w:p>
@@ -71,6 +78,9 @@
           </w:tcPr>
           <w:p>
             <w:r>
+              <w:rPr>
+                <w:b/>
+              </w:rPr>
               <w:t>Prepared By:</w:t>
             </w:r>
           </w:p>
@@ -93,6 +103,9 @@
           </w:tcPr>
           <w:p>
             <w:r>
+              <w:rPr>
+                <w:b/>
+              </w:rPr>
               <w:t>Department:</w:t>
             </w:r>
           </w:p>
@@ -120,7 +133,7 @@
     </w:p>
     <w:p>
       <w:r>
-        <w:t>This SOP describes the preparation of Tris-HCl buffer (50 mM, pH 7.4) for use in downstream purification steps of monoclonal antibody mAb-X production.</w:t>
+        <w:t>This SOP describes the preparation of Tris-HCl buffer (50 mM, pH 7.4) for use in downstream purification steps of monoclonal antibody production at Acme Therapeutics.</w:t>
       </w:r>
     </w:p>
     <w:p>
@@ -133,7 +146,7 @@
     </w:p>
     <w:p>
       <w:r>
-        <w:t>This procedure applies to all Process Development scientists and associates at Acme Therapeutics who perform buffer preparation for the AAV Campaign Q1 project.</w:t>
+        <w:t>This procedure applies to all Process Development scientists and associates at Acme Therapeutics who perform buffer preparation for the AAV Production Campaign Q1 project.</w:t>
       </w:r>
     </w:p>
     <w:p>
@@ -146,7 +159,7 @@
     </w:p>
     <w:tbl>
       <w:tblPr>
-        <w:tblStyle w:val="LightGrid-Accent1"/>
+        <w:tblStyle w:val="TableGrid"/>
         <w:tblW w:type="auto" w:w="0"/>
         <w:tblLook w:firstColumn="1" w:firstRow="1" w:lastColumn="0" w:lastRow="0" w:noHBand="0" w:noVBand="1" w:val="04A0"/>
       </w:tblPr>
@@ -162,6 +175,9 @@
           </w:tcPr>
           <w:p>
             <w:r>
+              <w:rPr>
+                <w:b/>
+              </w:rPr>
               <w:t>Item</w:t>
             </w:r>
           </w:p>
@@ -172,6 +188,9 @@
           </w:tcPr>
           <w:p>
             <w:r>
+              <w:rPr>
+                <w:b/>
+              </w:rPr>
               <w:t>Specification</w:t>
             </w:r>
           </w:p>
@@ -182,6 +201,9 @@
           </w:tcPr>
           <w:p>
             <w:r>
+              <w:rPr>
+                <w:b/>
+              </w:rPr>
               <w:t>Lot Number</w:t>
             </w:r>
           </w:p>
@@ -327,7 +349,7 @@
     </w:p>
     <w:tbl>
       <w:tblPr>
-        <w:tblStyle w:val="LightGrid-Accent1"/>
+        <w:tblStyle w:val="TableGrid"/>
         <w:tblW w:type="auto" w:w="0"/>
         <w:tblLook w:firstColumn="1" w:firstRow="1" w:lastColumn="0" w:lastRow="0" w:noHBand="0" w:noVBand="1" w:val="04A0"/>
       </w:tblPr>
@@ -345,6 +367,9 @@
           </w:tcPr>
           <w:p>
             <w:r>
+              <w:rPr>
+                <w:b/>
+              </w:rPr>
               <w:t>Step</w:t>
             </w:r>
           </w:p>
@@ -355,6 +380,9 @@
           </w:tcPr>
           <w:p>
             <w:r>
+              <w:rPr>
+                <w:b/>
+              </w:rPr>
               <w:t>Description</w:t>
             </w:r>
           </w:p>
@@ -365,6 +393,9 @@
           </w:tcPr>
           <w:p>
             <w:r>
+              <w:rPr>
+                <w:b/>
+              </w:rPr>
               <w:t>Duration (min)</w:t>
             </w:r>
           </w:p>
@@ -375,6 +406,9 @@
           </w:tcPr>
           <w:p>
             <w:r>
+              <w:rPr>
+                <w:b/>
+              </w:rPr>
               <w:t>Operator</w:t>
             </w:r>
           </w:p>
@@ -385,6 +419,9 @@
           </w:tcPr>
           <w:p>
             <w:r>
+              <w:rPr>
+                <w:b/>
+              </w:rPr>
               <w:t>Status</w:t>
             </w:r>
           </w:p>
@@ -459,7 +496,7 @@
           </w:tcPr>
           <w:p>
             <w:r>
-              <w:t>Add Tris Base to 800 mL purified water in 1L graduated cylinder</w:t>
+              <w:t>Add Tris Base to 800 mL purified water in 1L beaker</w:t>
             </w:r>
           </w:p>
         </w:tc>
@@ -563,7 +600,7 @@
           </w:tcPr>
           <w:p>
             <w:r>
-              <w:t>Adjust pH to 7.4 using 1N HCl (approx 30 mL required)</w:t>
+              <w:t>Adjust pH to 7.4 using 1N HCl (approx 30 mL added)</w:t>
             </w:r>
           </w:p>
         </w:tc>
@@ -650,58 +687,6 @@
           </w:p>
         </w:tc>
       </w:tr>
-      <w:tr>
-        <w:tc>
-          <w:tcPr>
-            <w:tcW w:type="dxa" w:w="1728"/>
-          </w:tcPr>
-          <w:p>
-            <w:r>
-              <w:t>6</w:t>
-            </w:r>
-          </w:p>
-        </w:tc>
-        <w:tc>
-          <w:tcPr>
-            <w:tcW w:type="dxa" w:w="1728"/>
-          </w:tcPr>
-          <w:p>
-            <w:r>
-              <w:t>Filter through 0.22 μm membrane filter into sterile container</w:t>
-            </w:r>
-          </w:p>
-        </w:tc>
-        <w:tc>
-          <w:tcPr>
-            <w:tcW w:type="dxa" w:w="1728"/>
-          </w:tcPr>
-          <w:p>
-            <w:r>
-              <w:t>10</w:t>
-            </w:r>
-          </w:p>
-        </w:tc>
-        <w:tc>
-          <w:tcPr>
-            <w:tcW w:type="dxa" w:w="1728"/>
-          </w:tcPr>
-          <w:p>
-            <w:r>
-              <w:t>SC</w:t>
-            </w:r>
-          </w:p>
-        </w:tc>
-        <w:tc>
-          <w:tcPr>
-            <w:tcW w:type="dxa" w:w="1728"/>
-          </w:tcPr>
-          <w:p>
-            <w:r>
-              <w:t>Complete</w:t>
-            </w:r>
-          </w:p>
-        </w:tc>
-      </w:tr>
     </w:tbl>
     <w:p/>
     <w:p>
@@ -714,7 +699,7 @@
     </w:p>
     <w:tbl>
       <w:tblPr>
-        <w:tblStyle w:val="LightGrid-Accent1"/>
+        <w:tblStyle w:val="TableGrid"/>
         <w:tblW w:type="auto" w:w="0"/>
         <w:tblLook w:firstColumn="1" w:firstRow="1" w:lastColumn="0" w:lastRow="0" w:noHBand="0" w:noVBand="1" w:val="04A0"/>
       </w:tblPr>
@@ -729,6 +714,9 @@
           </w:tcPr>
           <w:p>
             <w:r>
+              <w:rPr>
+                <w:b/>
+              </w:rPr>
               <w:t>Final pH:</w:t>
             </w:r>
           </w:p>
@@ -751,6 +739,9 @@
           </w:tcPr>
           <w:p>
             <w:r>
+              <w:rPr>
+                <w:b/>
+              </w:rPr>
               <w:t>Final Volume:</w:t>
             </w:r>
           </w:p>
@@ -773,6 +764,9 @@
           </w:tcPr>
           <w:p>
             <w:r>
+              <w:rPr>
+                <w:b/>
+              </w:rPr>
               <w:t>Visual Appearance:</w:t>
             </w:r>
           </w:p>
@@ -795,6 +789,9 @@
           </w:tcPr>
           <w:p>
             <w:r>
+              <w:rPr>
+                <w:b/>
+              </w:rPr>
               <w:t>Conductivity:</w:t>
             </w:r>
           </w:p>
@@ -822,7 +819,7 @@
     </w:p>
     <w:tbl>
       <w:tblPr>
-        <w:tblStyle w:val="LightGrid-Accent1"/>
+        <w:tblStyle w:val="TableGrid"/>
         <w:tblW w:type="auto" w:w="0"/>
         <w:tblLook w:firstColumn="1" w:firstRow="1" w:lastColumn="0" w:lastRow="0" w:noHBand="0" w:noVBand="1" w:val="04A0"/>
       </w:tblPr>
@@ -838,6 +835,9 @@
           </w:tcPr>
           <w:p>
             <w:r>
+              <w:rPr>
+                <w:b/>
+              </w:rPr>
               <w:t>Role</w:t>
             </w:r>
           </w:p>
@@ -848,6 +848,9 @@
           </w:tcPr>
           <w:p>
             <w:r>
+              <w:rPr>
+                <w:b/>
+              </w:rPr>
               <w:t>Name</w:t>
             </w:r>
           </w:p>
@@ -858,6 +861,9 @@
           </w:tcPr>
           <w:p>
             <w:r>
+              <w:rPr>
+                <w:b/>
+              </w:rPr>
               <w:t>Date</w:t>
             </w:r>
           </w:p>

</xml_diff>